<commit_message>
Add direct links to Year 8 Agriculture program
</commit_message>
<xml_diff>
--- a/resources/teacher/Agriculture-50-Period-Teaching-Program-v3.0-2027-Elective.docx
+++ b/resources/teacher/Agriculture-50-Period-Teaching-Program-v3.0-2027-Elective.docx
@@ -497,6 +497,19 @@
       <w:r>
         <w:t xml:space="preserve"> | Current local practical procedures, issued project documents and formal assessment records remain controlling where applicable.</w:t>
       </w:r>
+      <w:r>
+        <w:t xml:space="preserve"> | </w:t>
+      </w:r>
+      <w:hyperlink r:id="rId57">
+        <w:r>
+          <w:rPr>
+            <w:rStyle w:val="Hyperlink"/>
+            <w:color w:val="0563C1"/>
+            <w:u w:val="single"/>
+          </w:rPr>
+          <w:t>Open the Year 8 Agriculture course site</w:t>
+        </w:r>
+      </w:hyperlink>
     </w:p>
     <w:p>
       <w:pPr>
@@ -1223,16 +1236,26 @@
               <w:spacing w:before="0" w:after="0" w:line="240" w:lineRule="auto"/>
               <w:jc w:val="center"/>
             </w:pPr>
-            <w:r/>
-            <w:r>
-              <w:rPr>
-                <w:rFonts w:ascii="Aptos" w:hAnsi="Aptos"/>
-                <w:b w:val="0"/>
-                <w:color w:val="243229"/>
-                <w:sz w:val="19"/>
-              </w:rPr>
-              <w:t>Site/theory</w:t>
-            </w:r>
+            <w:hyperlink r:id="rId13">
+              <w:r>
+                <w:rPr>
+                  <w:rStyle w:val="Hyperlink"/>
+                  <w:color w:val="0563C1"/>
+                  <w:u w:val="single"/>
+                </w:rPr>
+              </w:r>
+              <w:r>
+                <w:rPr>
+                  <w:rStyle w:val="Hyperlink"/>
+                  <w:rFonts w:ascii="Aptos" w:hAnsi="Aptos"/>
+                  <w:b w:val="0"/>
+                  <w:color w:val="0563C1"/>
+                  <w:sz w:val="19"/>
+                  <w:u w:val="single"/>
+                </w:rPr>
+                <w:t>Site/theory</w:t>
+              </w:r>
+            </w:hyperlink>
           </w:p>
         </w:tc>
         <w:tc>
@@ -1245,16 +1268,26 @@
               <w:spacing w:before="0" w:after="0" w:line="240" w:lineRule="auto"/>
               <w:jc w:val="left"/>
             </w:pPr>
-            <w:r/>
-            <w:r>
-              <w:rPr>
-                <w:rFonts w:ascii="Aptos" w:hAnsi="Aptos"/>
-                <w:b w:val="0"/>
-                <w:color w:val="243229"/>
-                <w:sz w:val="19"/>
-              </w:rPr>
-              <w:t>Agriculture and everyday life</w:t>
-            </w:r>
+            <w:hyperlink r:id="rId13">
+              <w:r>
+                <w:rPr>
+                  <w:rStyle w:val="Hyperlink"/>
+                  <w:color w:val="0563C1"/>
+                  <w:u w:val="single"/>
+                </w:rPr>
+              </w:r>
+              <w:r>
+                <w:rPr>
+                  <w:rStyle w:val="Hyperlink"/>
+                  <w:rFonts w:ascii="Aptos" w:hAnsi="Aptos"/>
+                  <w:b w:val="0"/>
+                  <w:color w:val="0563C1"/>
+                  <w:sz w:val="19"/>
+                  <w:u w:val="single"/>
+                </w:rPr>
+                <w:t>Agriculture and everyday life</w:t>
+              </w:r>
+            </w:hyperlink>
           </w:p>
         </w:tc>
         <w:tc>
@@ -1362,16 +1395,26 @@
               <w:spacing w:before="0" w:after="0" w:line="240" w:lineRule="auto"/>
               <w:jc w:val="center"/>
             </w:pPr>
-            <w:r/>
-            <w:r>
-              <w:rPr>
-                <w:rFonts w:ascii="Aptos" w:hAnsi="Aptos"/>
-                <w:b w:val="0"/>
-                <w:color w:val="243229"/>
-                <w:sz w:val="19"/>
-              </w:rPr>
-              <w:t>Site/theory</w:t>
-            </w:r>
+            <w:hyperlink r:id="rId14">
+              <w:r>
+                <w:rPr>
+                  <w:rStyle w:val="Hyperlink"/>
+                  <w:color w:val="0563C1"/>
+                  <w:u w:val="single"/>
+                </w:rPr>
+              </w:r>
+              <w:r>
+                <w:rPr>
+                  <w:rStyle w:val="Hyperlink"/>
+                  <w:rFonts w:ascii="Aptos" w:hAnsi="Aptos"/>
+                  <w:b w:val="0"/>
+                  <w:color w:val="0563C1"/>
+                  <w:sz w:val="19"/>
+                  <w:u w:val="single"/>
+                </w:rPr>
+                <w:t>Site/theory</w:t>
+              </w:r>
+            </w:hyperlink>
           </w:p>
         </w:tc>
         <w:tc>
@@ -1385,16 +1428,26 @@
               <w:spacing w:before="0" w:after="0" w:line="240" w:lineRule="auto"/>
               <w:jc w:val="left"/>
             </w:pPr>
-            <w:r/>
-            <w:r>
-              <w:rPr>
-                <w:rFonts w:ascii="Aptos" w:hAnsi="Aptos"/>
-                <w:b w:val="0"/>
-                <w:color w:val="243229"/>
-                <w:sz w:val="19"/>
-              </w:rPr>
-              <w:t>Agricultural industry sectors</w:t>
-            </w:r>
+            <w:hyperlink r:id="rId14">
+              <w:r>
+                <w:rPr>
+                  <w:rStyle w:val="Hyperlink"/>
+                  <w:color w:val="0563C1"/>
+                  <w:u w:val="single"/>
+                </w:rPr>
+              </w:r>
+              <w:r>
+                <w:rPr>
+                  <w:rStyle w:val="Hyperlink"/>
+                  <w:rFonts w:ascii="Aptos" w:hAnsi="Aptos"/>
+                  <w:b w:val="0"/>
+                  <w:color w:val="0563C1"/>
+                  <w:sz w:val="19"/>
+                  <w:u w:val="single"/>
+                </w:rPr>
+                <w:t>Agricultural industry sectors</w:t>
+              </w:r>
+            </w:hyperlink>
           </w:p>
         </w:tc>
         <w:tc>
@@ -1503,16 +1556,26 @@
               <w:spacing w:before="0" w:after="0" w:line="240" w:lineRule="auto"/>
               <w:jc w:val="center"/>
             </w:pPr>
-            <w:r/>
-            <w:r>
-              <w:rPr>
-                <w:rFonts w:ascii="Aptos" w:hAnsi="Aptos"/>
-                <w:b w:val="0"/>
-                <w:color w:val="243229"/>
-                <w:sz w:val="19"/>
-              </w:rPr>
-              <w:t>Project/folio</w:t>
-            </w:r>
+            <w:hyperlink r:id="rId15">
+              <w:r>
+                <w:rPr>
+                  <w:rStyle w:val="Hyperlink"/>
+                  <w:color w:val="0563C1"/>
+                  <w:u w:val="single"/>
+                </w:rPr>
+              </w:r>
+              <w:r>
+                <w:rPr>
+                  <w:rStyle w:val="Hyperlink"/>
+                  <w:rFonts w:ascii="Aptos" w:hAnsi="Aptos"/>
+                  <w:b w:val="0"/>
+                  <w:color w:val="0563C1"/>
+                  <w:sz w:val="19"/>
+                  <w:u w:val="single"/>
+                </w:rPr>
+                <w:t>Project/folio</w:t>
+              </w:r>
+            </w:hyperlink>
           </w:p>
         </w:tc>
         <w:tc>
@@ -1525,16 +1588,26 @@
               <w:spacing w:before="0" w:after="0" w:line="240" w:lineRule="auto"/>
               <w:jc w:val="left"/>
             </w:pPr>
-            <w:r/>
-            <w:r>
-              <w:rPr>
-                <w:rFonts w:ascii="Aptos" w:hAnsi="Aptos"/>
-                <w:b w:val="0"/>
-                <w:color w:val="243229"/>
-                <w:sz w:val="19"/>
-              </w:rPr>
-              <w:t>Change in Australian agriculture</w:t>
-            </w:r>
+            <w:hyperlink r:id="rId16">
+              <w:r>
+                <w:rPr>
+                  <w:rStyle w:val="Hyperlink"/>
+                  <w:color w:val="0563C1"/>
+                  <w:u w:val="single"/>
+                </w:rPr>
+              </w:r>
+              <w:r>
+                <w:rPr>
+                  <w:rStyle w:val="Hyperlink"/>
+                  <w:rFonts w:ascii="Aptos" w:hAnsi="Aptos"/>
+                  <w:b w:val="0"/>
+                  <w:color w:val="0563C1"/>
+                  <w:sz w:val="19"/>
+                  <w:u w:val="single"/>
+                </w:rPr>
+                <w:t>Change in Australian agriculture</w:t>
+              </w:r>
+            </w:hyperlink>
           </w:p>
         </w:tc>
         <w:tc>
@@ -1922,16 +1995,26 @@
               <w:spacing w:before="0" w:after="0" w:line="240" w:lineRule="auto"/>
               <w:jc w:val="center"/>
             </w:pPr>
-            <w:r/>
-            <w:r>
-              <w:rPr>
-                <w:rFonts w:ascii="Aptos" w:hAnsi="Aptos"/>
-                <w:b w:val="0"/>
-                <w:color w:val="243229"/>
-                <w:sz w:val="19"/>
-              </w:rPr>
-              <w:t>Site/theory</w:t>
-            </w:r>
+            <w:hyperlink r:id="rId17">
+              <w:r>
+                <w:rPr>
+                  <w:rStyle w:val="Hyperlink"/>
+                  <w:color w:val="0563C1"/>
+                  <w:u w:val="single"/>
+                </w:rPr>
+              </w:r>
+              <w:r>
+                <w:rPr>
+                  <w:rStyle w:val="Hyperlink"/>
+                  <w:rFonts w:ascii="Aptos" w:hAnsi="Aptos"/>
+                  <w:b w:val="0"/>
+                  <w:color w:val="0563C1"/>
+                  <w:sz w:val="19"/>
+                  <w:u w:val="single"/>
+                </w:rPr>
+                <w:t>Site/theory</w:t>
+              </w:r>
+            </w:hyperlink>
           </w:p>
         </w:tc>
         <w:tc>
@@ -1945,16 +2028,26 @@
               <w:spacing w:before="0" w:after="0" w:line="240" w:lineRule="auto"/>
               <w:jc w:val="left"/>
             </w:pPr>
-            <w:r/>
-            <w:r>
-              <w:rPr>
-                <w:rFonts w:ascii="Aptos" w:hAnsi="Aptos"/>
-                <w:b w:val="0"/>
-                <w:color w:val="243229"/>
-                <w:sz w:val="19"/>
-              </w:rPr>
-              <w:t>Agriculture and connected markets</w:t>
-            </w:r>
+            <w:hyperlink r:id="rId17">
+              <w:r>
+                <w:rPr>
+                  <w:rStyle w:val="Hyperlink"/>
+                  <w:color w:val="0563C1"/>
+                  <w:u w:val="single"/>
+                </w:rPr>
+              </w:r>
+              <w:r>
+                <w:rPr>
+                  <w:rStyle w:val="Hyperlink"/>
+                  <w:rFonts w:ascii="Aptos" w:hAnsi="Aptos"/>
+                  <w:b w:val="0"/>
+                  <w:color w:val="0563C1"/>
+                  <w:sz w:val="19"/>
+                  <w:u w:val="single"/>
+                </w:rPr>
+                <w:t>Agriculture and connected markets</w:t>
+              </w:r>
+            </w:hyperlink>
           </w:p>
         </w:tc>
         <w:tc>
@@ -2063,16 +2156,26 @@
               <w:spacing w:before="0" w:after="0" w:line="240" w:lineRule="auto"/>
               <w:jc w:val="center"/>
             </w:pPr>
-            <w:r/>
-            <w:r>
-              <w:rPr>
-                <w:rFonts w:ascii="Aptos" w:hAnsi="Aptos"/>
-                <w:b w:val="0"/>
-                <w:color w:val="243229"/>
-                <w:sz w:val="19"/>
-              </w:rPr>
-              <w:t>Site/theory</w:t>
-            </w:r>
+            <w:hyperlink r:id="rId18">
+              <w:r>
+                <w:rPr>
+                  <w:rStyle w:val="Hyperlink"/>
+                  <w:color w:val="0563C1"/>
+                  <w:u w:val="single"/>
+                </w:rPr>
+              </w:r>
+              <w:r>
+                <w:rPr>
+                  <w:rStyle w:val="Hyperlink"/>
+                  <w:rFonts w:ascii="Aptos" w:hAnsi="Aptos"/>
+                  <w:b w:val="0"/>
+                  <w:color w:val="0563C1"/>
+                  <w:sz w:val="19"/>
+                  <w:u w:val="single"/>
+                </w:rPr>
+                <w:t>Site/theory</w:t>
+              </w:r>
+            </w:hyperlink>
           </w:p>
         </w:tc>
         <w:tc>
@@ -2085,16 +2188,26 @@
               <w:spacing w:before="0" w:after="0" w:line="240" w:lineRule="auto"/>
               <w:jc w:val="left"/>
             </w:pPr>
-            <w:r/>
-            <w:r>
-              <w:rPr>
-                <w:rFonts w:ascii="Aptos" w:hAnsi="Aptos"/>
-                <w:b w:val="0"/>
-                <w:color w:val="243229"/>
-                <w:sz w:val="19"/>
-              </w:rPr>
-              <w:t>The four dimensions of food security</w:t>
-            </w:r>
+            <w:hyperlink r:id="rId18">
+              <w:r>
+                <w:rPr>
+                  <w:rStyle w:val="Hyperlink"/>
+                  <w:color w:val="0563C1"/>
+                  <w:u w:val="single"/>
+                </w:rPr>
+              </w:r>
+              <w:r>
+                <w:rPr>
+                  <w:rStyle w:val="Hyperlink"/>
+                  <w:rFonts w:ascii="Aptos" w:hAnsi="Aptos"/>
+                  <w:b w:val="0"/>
+                  <w:color w:val="0563C1"/>
+                  <w:sz w:val="19"/>
+                  <w:u w:val="single"/>
+                </w:rPr>
+                <w:t>The four dimensions of food security</w:t>
+              </w:r>
+            </w:hyperlink>
           </w:p>
         </w:tc>
         <w:tc>
@@ -2202,16 +2315,26 @@
               <w:spacing w:before="0" w:after="0" w:line="240" w:lineRule="auto"/>
               <w:jc w:val="center"/>
             </w:pPr>
-            <w:r/>
-            <w:r>
-              <w:rPr>
-                <w:rFonts w:ascii="Aptos" w:hAnsi="Aptos"/>
-                <w:b w:val="0"/>
-                <w:color w:val="243229"/>
-                <w:sz w:val="19"/>
-              </w:rPr>
-              <w:t>Project/folio</w:t>
-            </w:r>
+            <w:hyperlink r:id="rId19">
+              <w:r>
+                <w:rPr>
+                  <w:rStyle w:val="Hyperlink"/>
+                  <w:color w:val="0563C1"/>
+                  <w:u w:val="single"/>
+                </w:rPr>
+              </w:r>
+              <w:r>
+                <w:rPr>
+                  <w:rStyle w:val="Hyperlink"/>
+                  <w:rFonts w:ascii="Aptos" w:hAnsi="Aptos"/>
+                  <w:b w:val="0"/>
+                  <w:color w:val="0563C1"/>
+                  <w:sz w:val="19"/>
+                  <w:u w:val="single"/>
+                </w:rPr>
+                <w:t>Project/folio</w:t>
+              </w:r>
+            </w:hyperlink>
           </w:p>
         </w:tc>
         <w:tc>
@@ -2225,16 +2348,26 @@
               <w:spacing w:before="0" w:after="0" w:line="240" w:lineRule="auto"/>
               <w:jc w:val="left"/>
             </w:pPr>
-            <w:r/>
-            <w:r>
-              <w:rPr>
-                <w:rFonts w:ascii="Aptos" w:hAnsi="Aptos"/>
-                <w:b w:val="0"/>
-                <w:color w:val="243229"/>
-                <w:sz w:val="19"/>
-              </w:rPr>
-              <w:t>Threats and resilient responses</w:t>
-            </w:r>
+            <w:hyperlink r:id="rId20">
+              <w:r>
+                <w:rPr>
+                  <w:rStyle w:val="Hyperlink"/>
+                  <w:color w:val="0563C1"/>
+                  <w:u w:val="single"/>
+                </w:rPr>
+              </w:r>
+              <w:r>
+                <w:rPr>
+                  <w:rStyle w:val="Hyperlink"/>
+                  <w:rFonts w:ascii="Aptos" w:hAnsi="Aptos"/>
+                  <w:b w:val="0"/>
+                  <w:color w:val="0563C1"/>
+                  <w:sz w:val="19"/>
+                  <w:u w:val="single"/>
+                </w:rPr>
+                <w:t>Threats and resilient responses</w:t>
+              </w:r>
+            </w:hyperlink>
           </w:p>
         </w:tc>
         <w:tc>
@@ -2824,16 +2957,26 @@
               <w:spacing w:before="0" w:after="0" w:line="240" w:lineRule="auto"/>
               <w:jc w:val="center"/>
             </w:pPr>
-            <w:r/>
-            <w:r>
-              <w:rPr>
-                <w:rFonts w:ascii="Aptos" w:hAnsi="Aptos"/>
-                <w:b w:val="0"/>
-                <w:color w:val="243229"/>
-                <w:sz w:val="19"/>
-              </w:rPr>
-              <w:t>Site/theory</w:t>
-            </w:r>
+            <w:hyperlink r:id="rId21">
+              <w:r>
+                <w:rPr>
+                  <w:rStyle w:val="Hyperlink"/>
+                  <w:color w:val="0563C1"/>
+                  <w:u w:val="single"/>
+                </w:rPr>
+              </w:r>
+              <w:r>
+                <w:rPr>
+                  <w:rStyle w:val="Hyperlink"/>
+                  <w:rFonts w:ascii="Aptos" w:hAnsi="Aptos"/>
+                  <w:b w:val="0"/>
+                  <w:color w:val="0563C1"/>
+                  <w:sz w:val="19"/>
+                  <w:u w:val="single"/>
+                </w:rPr>
+                <w:t>Site/theory</w:t>
+              </w:r>
+            </w:hyperlink>
           </w:p>
         </w:tc>
         <w:tc>
@@ -2846,16 +2989,26 @@
               <w:spacing w:before="0" w:after="0" w:line="240" w:lineRule="auto"/>
               <w:jc w:val="left"/>
             </w:pPr>
-            <w:r/>
-            <w:r>
-              <w:rPr>
-                <w:rFonts w:ascii="Aptos" w:hAnsi="Aptos"/>
-                <w:b w:val="0"/>
-                <w:color w:val="243229"/>
-                <w:sz w:val="19"/>
-              </w:rPr>
-              <w:t>Cattle groups and adaptation clues</w:t>
-            </w:r>
+            <w:hyperlink r:id="rId21">
+              <w:r>
+                <w:rPr>
+                  <w:rStyle w:val="Hyperlink"/>
+                  <w:color w:val="0563C1"/>
+                  <w:u w:val="single"/>
+                </w:rPr>
+              </w:r>
+              <w:r>
+                <w:rPr>
+                  <w:rStyle w:val="Hyperlink"/>
+                  <w:rFonts w:ascii="Aptos" w:hAnsi="Aptos"/>
+                  <w:b w:val="0"/>
+                  <w:color w:val="0563C1"/>
+                  <w:sz w:val="19"/>
+                  <w:u w:val="single"/>
+                </w:rPr>
+                <w:t>Cattle groups and adaptation clues</w:t>
+              </w:r>
+            </w:hyperlink>
           </w:p>
         </w:tc>
         <w:tc>
@@ -2963,16 +3116,26 @@
               <w:spacing w:before="0" w:after="0" w:line="240" w:lineRule="auto"/>
               <w:jc w:val="center"/>
             </w:pPr>
-            <w:r/>
-            <w:r>
-              <w:rPr>
-                <w:rFonts w:ascii="Aptos" w:hAnsi="Aptos"/>
-                <w:b w:val="0"/>
-                <w:color w:val="243229"/>
-                <w:sz w:val="19"/>
-              </w:rPr>
-              <w:t>Site/theory</w:t>
-            </w:r>
+            <w:hyperlink r:id="rId22">
+              <w:r>
+                <w:rPr>
+                  <w:rStyle w:val="Hyperlink"/>
+                  <w:color w:val="0563C1"/>
+                  <w:u w:val="single"/>
+                </w:rPr>
+              </w:r>
+              <w:r>
+                <w:rPr>
+                  <w:rStyle w:val="Hyperlink"/>
+                  <w:rFonts w:ascii="Aptos" w:hAnsi="Aptos"/>
+                  <w:b w:val="0"/>
+                  <w:color w:val="0563C1"/>
+                  <w:sz w:val="19"/>
+                  <w:u w:val="single"/>
+                </w:rPr>
+                <w:t>Site/theory</w:t>
+              </w:r>
+            </w:hyperlink>
           </w:p>
         </w:tc>
         <w:tc>
@@ -2986,16 +3149,26 @@
               <w:spacing w:before="0" w:after="0" w:line="240" w:lineRule="auto"/>
               <w:jc w:val="left"/>
             </w:pPr>
-            <w:r/>
-            <w:r>
-              <w:rPr>
-                <w:rFonts w:ascii="Aptos" w:hAnsi="Aptos"/>
-                <w:b w:val="0"/>
-                <w:color w:val="243229"/>
-                <w:sz w:val="19"/>
-              </w:rPr>
-              <w:t>Selective breeding and evidence</w:t>
-            </w:r>
+            <w:hyperlink r:id="rId22">
+              <w:r>
+                <w:rPr>
+                  <w:rStyle w:val="Hyperlink"/>
+                  <w:color w:val="0563C1"/>
+                  <w:u w:val="single"/>
+                </w:rPr>
+              </w:r>
+              <w:r>
+                <w:rPr>
+                  <w:rStyle w:val="Hyperlink"/>
+                  <w:rFonts w:ascii="Aptos" w:hAnsi="Aptos"/>
+                  <w:b w:val="0"/>
+                  <w:color w:val="0563C1"/>
+                  <w:sz w:val="19"/>
+                  <w:u w:val="single"/>
+                </w:rPr>
+                <w:t>Selective breeding and evidence</w:t>
+              </w:r>
+            </w:hyperlink>
           </w:p>
         </w:tc>
         <w:tc>
@@ -3104,16 +3277,26 @@
               <w:spacing w:before="0" w:after="0" w:line="240" w:lineRule="auto"/>
               <w:jc w:val="center"/>
             </w:pPr>
-            <w:r/>
-            <w:r>
-              <w:rPr>
-                <w:rFonts w:ascii="Aptos" w:hAnsi="Aptos"/>
-                <w:b w:val="0"/>
-                <w:color w:val="243229"/>
-                <w:sz w:val="19"/>
-              </w:rPr>
-              <w:t>Project/folio</w:t>
-            </w:r>
+            <w:hyperlink r:id="rId23">
+              <w:r>
+                <w:rPr>
+                  <w:rStyle w:val="Hyperlink"/>
+                  <w:color w:val="0563C1"/>
+                  <w:u w:val="single"/>
+                </w:rPr>
+              </w:r>
+              <w:r>
+                <w:rPr>
+                  <w:rStyle w:val="Hyperlink"/>
+                  <w:rFonts w:ascii="Aptos" w:hAnsi="Aptos"/>
+                  <w:b w:val="0"/>
+                  <w:color w:val="0563C1"/>
+                  <w:sz w:val="19"/>
+                  <w:u w:val="single"/>
+                </w:rPr>
+                <w:t>Project/folio</w:t>
+              </w:r>
+            </w:hyperlink>
           </w:p>
         </w:tc>
         <w:tc>
@@ -3126,16 +3309,26 @@
               <w:spacing w:before="0" w:after="0" w:line="240" w:lineRule="auto"/>
               <w:jc w:val="left"/>
             </w:pPr>
-            <w:r/>
-            <w:r>
-              <w:rPr>
-                <w:rFonts w:ascii="Aptos" w:hAnsi="Aptos"/>
-                <w:b w:val="0"/>
-                <w:color w:val="243229"/>
-                <w:sz w:val="19"/>
-              </w:rPr>
-              <w:t>Matching cattle to a production environment</w:t>
-            </w:r>
+            <w:hyperlink r:id="rId24">
+              <w:r>
+                <w:rPr>
+                  <w:rStyle w:val="Hyperlink"/>
+                  <w:color w:val="0563C1"/>
+                  <w:u w:val="single"/>
+                </w:rPr>
+              </w:r>
+              <w:r>
+                <w:rPr>
+                  <w:rStyle w:val="Hyperlink"/>
+                  <w:rFonts w:ascii="Aptos" w:hAnsi="Aptos"/>
+                  <w:b w:val="0"/>
+                  <w:color w:val="0563C1"/>
+                  <w:sz w:val="19"/>
+                  <w:u w:val="single"/>
+                </w:rPr>
+                <w:t>Matching cattle to a production environment</w:t>
+              </w:r>
+            </w:hyperlink>
           </w:p>
         </w:tc>
         <w:tc>
@@ -3523,16 +3716,26 @@
               <w:spacing w:before="0" w:after="0" w:line="240" w:lineRule="auto"/>
               <w:jc w:val="center"/>
             </w:pPr>
-            <w:r/>
-            <w:r>
-              <w:rPr>
-                <w:rFonts w:ascii="Aptos" w:hAnsi="Aptos"/>
-                <w:b w:val="0"/>
-                <w:color w:val="243229"/>
-                <w:sz w:val="19"/>
-              </w:rPr>
-              <w:t>Site/theory</w:t>
-            </w:r>
+            <w:hyperlink r:id="rId25">
+              <w:r>
+                <w:rPr>
+                  <w:rStyle w:val="Hyperlink"/>
+                  <w:color w:val="0563C1"/>
+                  <w:u w:val="single"/>
+                </w:rPr>
+              </w:r>
+              <w:r>
+                <w:rPr>
+                  <w:rStyle w:val="Hyperlink"/>
+                  <w:rFonts w:ascii="Aptos" w:hAnsi="Aptos"/>
+                  <w:b w:val="0"/>
+                  <w:color w:val="0563C1"/>
+                  <w:sz w:val="19"/>
+                  <w:u w:val="single"/>
+                </w:rPr>
+                <w:t>Site/theory</w:t>
+              </w:r>
+            </w:hyperlink>
           </w:p>
         </w:tc>
         <w:tc>
@@ -3546,16 +3749,26 @@
               <w:spacing w:before="0" w:after="0" w:line="240" w:lineRule="auto"/>
               <w:jc w:val="left"/>
             </w:pPr>
-            <w:r/>
-            <w:r>
-              <w:rPr>
-                <w:rFonts w:ascii="Aptos" w:hAnsi="Aptos"/>
-                <w:b w:val="0"/>
-                <w:color w:val="243229"/>
-                <w:sz w:val="19"/>
-              </w:rPr>
-              <w:t>Extensive and intensive beef systems</w:t>
-            </w:r>
+            <w:hyperlink r:id="rId25">
+              <w:r>
+                <w:rPr>
+                  <w:rStyle w:val="Hyperlink"/>
+                  <w:color w:val="0563C1"/>
+                  <w:u w:val="single"/>
+                </w:rPr>
+              </w:r>
+              <w:r>
+                <w:rPr>
+                  <w:rStyle w:val="Hyperlink"/>
+                  <w:rFonts w:ascii="Aptos" w:hAnsi="Aptos"/>
+                  <w:b w:val="0"/>
+                  <w:color w:val="0563C1"/>
+                  <w:sz w:val="19"/>
+                  <w:u w:val="single"/>
+                </w:rPr>
+                <w:t>Extensive and intensive beef systems</w:t>
+              </w:r>
+            </w:hyperlink>
           </w:p>
         </w:tc>
         <w:tc>
@@ -3865,16 +4078,26 @@
               <w:spacing w:before="0" w:after="0" w:line="240" w:lineRule="auto"/>
               <w:jc w:val="center"/>
             </w:pPr>
-            <w:r/>
-            <w:r>
-              <w:rPr>
-                <w:rFonts w:ascii="Aptos" w:hAnsi="Aptos"/>
-                <w:b w:val="0"/>
-                <w:color w:val="243229"/>
-                <w:sz w:val="19"/>
-              </w:rPr>
-              <w:t>Site/theory</w:t>
-            </w:r>
+            <w:hyperlink r:id="rId26">
+              <w:r>
+                <w:rPr>
+                  <w:rStyle w:val="Hyperlink"/>
+                  <w:color w:val="0563C1"/>
+                  <w:u w:val="single"/>
+                </w:rPr>
+              </w:r>
+              <w:r>
+                <w:rPr>
+                  <w:rStyle w:val="Hyperlink"/>
+                  <w:rFonts w:ascii="Aptos" w:hAnsi="Aptos"/>
+                  <w:b w:val="0"/>
+                  <w:color w:val="0563C1"/>
+                  <w:sz w:val="19"/>
+                  <w:u w:val="single"/>
+                </w:rPr>
+                <w:t>Site/theory</w:t>
+              </w:r>
+            </w:hyperlink>
           </w:p>
         </w:tc>
         <w:tc>
@@ -3887,16 +4110,26 @@
               <w:spacing w:before="0" w:after="0" w:line="240" w:lineRule="auto"/>
               <w:jc w:val="left"/>
             </w:pPr>
-            <w:r/>
-            <w:r>
-              <w:rPr>
-                <w:rFonts w:ascii="Aptos" w:hAnsi="Aptos"/>
-                <w:b w:val="0"/>
-                <w:color w:val="243229"/>
-                <w:sz w:val="19"/>
-              </w:rPr>
-              <w:t>Pasture and feedlot feeding pathways</w:t>
-            </w:r>
+            <w:hyperlink r:id="rId26">
+              <w:r>
+                <w:rPr>
+                  <w:rStyle w:val="Hyperlink"/>
+                  <w:color w:val="0563C1"/>
+                  <w:u w:val="single"/>
+                </w:rPr>
+              </w:r>
+              <w:r>
+                <w:rPr>
+                  <w:rStyle w:val="Hyperlink"/>
+                  <w:rFonts w:ascii="Aptos" w:hAnsi="Aptos"/>
+                  <w:b w:val="0"/>
+                  <w:color w:val="0563C1"/>
+                  <w:sz w:val="19"/>
+                  <w:u w:val="single"/>
+                </w:rPr>
+                <w:t>Pasture and feedlot feeding pathways</w:t>
+              </w:r>
+            </w:hyperlink>
           </w:p>
         </w:tc>
         <w:tc>
@@ -4004,16 +4237,26 @@
               <w:spacing w:before="0" w:after="0" w:line="240" w:lineRule="auto"/>
               <w:jc w:val="center"/>
             </w:pPr>
-            <w:r/>
-            <w:r>
-              <w:rPr>
-                <w:rFonts w:ascii="Aptos" w:hAnsi="Aptos"/>
-                <w:b w:val="0"/>
-                <w:color w:val="243229"/>
-                <w:sz w:val="19"/>
-              </w:rPr>
-              <w:t>Project/folio</w:t>
-            </w:r>
+            <w:hyperlink r:id="rId27">
+              <w:r>
+                <w:rPr>
+                  <w:rStyle w:val="Hyperlink"/>
+                  <w:color w:val="0563C1"/>
+                  <w:u w:val="single"/>
+                </w:rPr>
+              </w:r>
+              <w:r>
+                <w:rPr>
+                  <w:rStyle w:val="Hyperlink"/>
+                  <w:rFonts w:ascii="Aptos" w:hAnsi="Aptos"/>
+                  <w:b w:val="0"/>
+                  <w:color w:val="0563C1"/>
+                  <w:sz w:val="19"/>
+                  <w:u w:val="single"/>
+                </w:rPr>
+                <w:t>Project/folio</w:t>
+              </w:r>
+            </w:hyperlink>
           </w:p>
         </w:tc>
         <w:tc>
@@ -4027,16 +4270,26 @@
               <w:spacing w:before="0" w:after="0" w:line="240" w:lineRule="auto"/>
               <w:jc w:val="left"/>
             </w:pPr>
-            <w:r/>
-            <w:r>
-              <w:rPr>
-                <w:rFonts w:ascii="Aptos" w:hAnsi="Aptos"/>
-                <w:b w:val="0"/>
-                <w:color w:val="243229"/>
-                <w:sz w:val="19"/>
-              </w:rPr>
-              <w:t>Comparing systems with evidence</w:t>
-            </w:r>
+            <w:hyperlink r:id="rId28">
+              <w:r>
+                <w:rPr>
+                  <w:rStyle w:val="Hyperlink"/>
+                  <w:color w:val="0563C1"/>
+                  <w:u w:val="single"/>
+                </w:rPr>
+              </w:r>
+              <w:r>
+                <w:rPr>
+                  <w:rStyle w:val="Hyperlink"/>
+                  <w:rFonts w:ascii="Aptos" w:hAnsi="Aptos"/>
+                  <w:b w:val="0"/>
+                  <w:color w:val="0563C1"/>
+                  <w:sz w:val="19"/>
+                  <w:u w:val="single"/>
+                </w:rPr>
+                <w:t>Comparing systems with evidence</w:t>
+              </w:r>
+            </w:hyperlink>
           </w:p>
         </w:tc>
         <w:tc>
@@ -4425,16 +4678,26 @@
               <w:spacing w:before="0" w:after="0" w:line="240" w:lineRule="auto"/>
               <w:jc w:val="center"/>
             </w:pPr>
-            <w:r/>
-            <w:r>
-              <w:rPr>
-                <w:rFonts w:ascii="Aptos" w:hAnsi="Aptos"/>
-                <w:b w:val="0"/>
-                <w:color w:val="243229"/>
-                <w:sz w:val="19"/>
-              </w:rPr>
-              <w:t>Site/theory</w:t>
-            </w:r>
+            <w:hyperlink r:id="rId29">
+              <w:r>
+                <w:rPr>
+                  <w:rStyle w:val="Hyperlink"/>
+                  <w:color w:val="0563C1"/>
+                  <w:u w:val="single"/>
+                </w:rPr>
+              </w:r>
+              <w:r>
+                <w:rPr>
+                  <w:rStyle w:val="Hyperlink"/>
+                  <w:rFonts w:ascii="Aptos" w:hAnsi="Aptos"/>
+                  <w:b w:val="0"/>
+                  <w:color w:val="0563C1"/>
+                  <w:sz w:val="19"/>
+                  <w:u w:val="single"/>
+                </w:rPr>
+                <w:t>Site/theory</w:t>
+              </w:r>
+            </w:hyperlink>
           </w:p>
         </w:tc>
         <w:tc>
@@ -4447,16 +4710,26 @@
               <w:spacing w:before="0" w:after="0" w:line="240" w:lineRule="auto"/>
               <w:jc w:val="left"/>
             </w:pPr>
-            <w:r/>
-            <w:r>
-              <w:rPr>
-                <w:rFonts w:ascii="Aptos" w:hAnsi="Aptos"/>
-                <w:b w:val="0"/>
-                <w:color w:val="243229"/>
-                <w:sz w:val="19"/>
-              </w:rPr>
-              <w:t>Dairy breeds: traits and evidence</w:t>
-            </w:r>
+            <w:hyperlink r:id="rId29">
+              <w:r>
+                <w:rPr>
+                  <w:rStyle w:val="Hyperlink"/>
+                  <w:color w:val="0563C1"/>
+                  <w:u w:val="single"/>
+                </w:rPr>
+              </w:r>
+              <w:r>
+                <w:rPr>
+                  <w:rStyle w:val="Hyperlink"/>
+                  <w:rFonts w:ascii="Aptos" w:hAnsi="Aptos"/>
+                  <w:b w:val="0"/>
+                  <w:color w:val="0563C1"/>
+                  <w:sz w:val="19"/>
+                  <w:u w:val="single"/>
+                </w:rPr>
+                <w:t>Dairy breeds: traits and evidence</w:t>
+              </w:r>
+            </w:hyperlink>
           </w:p>
         </w:tc>
         <w:tc>
@@ -4564,16 +4837,26 @@
               <w:spacing w:before="0" w:after="0" w:line="240" w:lineRule="auto"/>
               <w:jc w:val="center"/>
             </w:pPr>
-            <w:r/>
-            <w:r>
-              <w:rPr>
-                <w:rFonts w:ascii="Aptos" w:hAnsi="Aptos"/>
-                <w:b w:val="0"/>
-                <w:color w:val="243229"/>
-                <w:sz w:val="19"/>
-              </w:rPr>
-              <w:t>Site/theory</w:t>
-            </w:r>
+            <w:hyperlink r:id="rId30">
+              <w:r>
+                <w:rPr>
+                  <w:rStyle w:val="Hyperlink"/>
+                  <w:color w:val="0563C1"/>
+                  <w:u w:val="single"/>
+                </w:rPr>
+              </w:r>
+              <w:r>
+                <w:rPr>
+                  <w:rStyle w:val="Hyperlink"/>
+                  <w:rFonts w:ascii="Aptos" w:hAnsi="Aptos"/>
+                  <w:b w:val="0"/>
+                  <w:color w:val="0563C1"/>
+                  <w:sz w:val="19"/>
+                  <w:u w:val="single"/>
+                </w:rPr>
+                <w:t>Site/theory</w:t>
+              </w:r>
+            </w:hyperlink>
           </w:p>
         </w:tc>
         <w:tc>
@@ -4587,16 +4870,26 @@
               <w:spacing w:before="0" w:after="0" w:line="240" w:lineRule="auto"/>
               <w:jc w:val="left"/>
             </w:pPr>
-            <w:r/>
-            <w:r>
-              <w:rPr>
-                <w:rFonts w:ascii="Aptos" w:hAnsi="Aptos"/>
-                <w:b w:val="0"/>
-                <w:color w:val="243229"/>
-                <w:sz w:val="19"/>
-              </w:rPr>
-              <w:t>Conditions, resources and dairy production</w:t>
-            </w:r>
+            <w:hyperlink r:id="rId30">
+              <w:r>
+                <w:rPr>
+                  <w:rStyle w:val="Hyperlink"/>
+                  <w:color w:val="0563C1"/>
+                  <w:u w:val="single"/>
+                </w:rPr>
+              </w:r>
+              <w:r>
+                <w:rPr>
+                  <w:rStyle w:val="Hyperlink"/>
+                  <w:rFonts w:ascii="Aptos" w:hAnsi="Aptos"/>
+                  <w:b w:val="0"/>
+                  <w:color w:val="0563C1"/>
+                  <w:sz w:val="19"/>
+                  <w:u w:val="single"/>
+                </w:rPr>
+                <w:t>Conditions, resources and dairy production</w:t>
+              </w:r>
+            </w:hyperlink>
           </w:p>
         </w:tc>
         <w:tc>
@@ -4705,16 +4998,26 @@
               <w:spacing w:before="0" w:after="0" w:line="240" w:lineRule="auto"/>
               <w:jc w:val="center"/>
             </w:pPr>
-            <w:r/>
-            <w:r>
-              <w:rPr>
-                <w:rFonts w:ascii="Aptos" w:hAnsi="Aptos"/>
-                <w:b w:val="0"/>
-                <w:color w:val="243229"/>
-                <w:sz w:val="19"/>
-              </w:rPr>
-              <w:t>Project/folio</w:t>
-            </w:r>
+            <w:hyperlink r:id="rId31">
+              <w:r>
+                <w:rPr>
+                  <w:rStyle w:val="Hyperlink"/>
+                  <w:color w:val="0563C1"/>
+                  <w:u w:val="single"/>
+                </w:rPr>
+              </w:r>
+              <w:r>
+                <w:rPr>
+                  <w:rStyle w:val="Hyperlink"/>
+                  <w:rFonts w:ascii="Aptos" w:hAnsi="Aptos"/>
+                  <w:b w:val="0"/>
+                  <w:color w:val="0563C1"/>
+                  <w:sz w:val="19"/>
+                  <w:u w:val="single"/>
+                </w:rPr>
+                <w:t>Project/folio</w:t>
+              </w:r>
+            </w:hyperlink>
           </w:p>
         </w:tc>
         <w:tc>
@@ -4727,16 +5030,26 @@
               <w:spacing w:before="0" w:after="0" w:line="240" w:lineRule="auto"/>
               <w:jc w:val="left"/>
             </w:pPr>
-            <w:r/>
-            <w:r>
-              <w:rPr>
-                <w:rFonts w:ascii="Aptos" w:hAnsi="Aptos"/>
-                <w:b w:val="0"/>
-                <w:color w:val="243229"/>
-                <w:sz w:val="19"/>
-              </w:rPr>
-              <w:t>From milk to value-added products</w:t>
-            </w:r>
+            <w:hyperlink r:id="rId32">
+              <w:r>
+                <w:rPr>
+                  <w:rStyle w:val="Hyperlink"/>
+                  <w:color w:val="0563C1"/>
+                  <w:u w:val="single"/>
+                </w:rPr>
+              </w:r>
+              <w:r>
+                <w:rPr>
+                  <w:rStyle w:val="Hyperlink"/>
+                  <w:rFonts w:ascii="Aptos" w:hAnsi="Aptos"/>
+                  <w:b w:val="0"/>
+                  <w:color w:val="0563C1"/>
+                  <w:sz w:val="19"/>
+                  <w:u w:val="single"/>
+                </w:rPr>
+                <w:t>From milk to value-added products</w:t>
+              </w:r>
+            </w:hyperlink>
           </w:p>
         </w:tc>
         <w:tc>
@@ -5325,16 +5638,26 @@
               <w:spacing w:before="0" w:after="0" w:line="240" w:lineRule="auto"/>
               <w:jc w:val="center"/>
             </w:pPr>
-            <w:r/>
-            <w:r>
-              <w:rPr>
-                <w:rFonts w:ascii="Aptos" w:hAnsi="Aptos"/>
-                <w:b w:val="0"/>
-                <w:color w:val="243229"/>
-                <w:sz w:val="19"/>
-              </w:rPr>
-              <w:t>Site/theory</w:t>
-            </w:r>
+            <w:hyperlink r:id="rId33">
+              <w:r>
+                <w:rPr>
+                  <w:rStyle w:val="Hyperlink"/>
+                  <w:color w:val="0563C1"/>
+                  <w:u w:val="single"/>
+                </w:rPr>
+              </w:r>
+              <w:r>
+                <w:rPr>
+                  <w:rStyle w:val="Hyperlink"/>
+                  <w:rFonts w:ascii="Aptos" w:hAnsi="Aptos"/>
+                  <w:b w:val="0"/>
+                  <w:color w:val="0563C1"/>
+                  <w:sz w:val="19"/>
+                  <w:u w:val="single"/>
+                </w:rPr>
+                <w:t>Site/theory</w:t>
+              </w:r>
+            </w:hyperlink>
           </w:p>
         </w:tc>
         <w:tc>
@@ -5348,16 +5671,26 @@
               <w:spacing w:before="0" w:after="0" w:line="240" w:lineRule="auto"/>
               <w:jc w:val="left"/>
             </w:pPr>
-            <w:r/>
-            <w:r>
-              <w:rPr>
-                <w:rFonts w:ascii="Aptos" w:hAnsi="Aptos"/>
-                <w:b w:val="0"/>
-                <w:color w:val="243229"/>
-                <w:sz w:val="19"/>
-              </w:rPr>
-              <w:t>Why milk is processed</w:t>
-            </w:r>
+            <w:hyperlink r:id="rId33">
+              <w:r>
+                <w:rPr>
+                  <w:rStyle w:val="Hyperlink"/>
+                  <w:color w:val="0563C1"/>
+                  <w:u w:val="single"/>
+                </w:rPr>
+              </w:r>
+              <w:r>
+                <w:rPr>
+                  <w:rStyle w:val="Hyperlink"/>
+                  <w:rFonts w:ascii="Aptos" w:hAnsi="Aptos"/>
+                  <w:b w:val="0"/>
+                  <w:color w:val="0563C1"/>
+                  <w:sz w:val="19"/>
+                  <w:u w:val="single"/>
+                </w:rPr>
+                <w:t>Why milk is processed</w:t>
+              </w:r>
+            </w:hyperlink>
           </w:p>
         </w:tc>
         <w:tc>
@@ -5466,16 +5799,26 @@
               <w:spacing w:before="0" w:after="0" w:line="240" w:lineRule="auto"/>
               <w:jc w:val="center"/>
             </w:pPr>
-            <w:r/>
-            <w:r>
-              <w:rPr>
-                <w:rFonts w:ascii="Aptos" w:hAnsi="Aptos"/>
-                <w:b w:val="0"/>
-                <w:color w:val="243229"/>
-                <w:sz w:val="19"/>
-              </w:rPr>
-              <w:t>Site/theory</w:t>
-            </w:r>
+            <w:hyperlink r:id="rId34">
+              <w:r>
+                <w:rPr>
+                  <w:rStyle w:val="Hyperlink"/>
+                  <w:color w:val="0563C1"/>
+                  <w:u w:val="single"/>
+                </w:rPr>
+              </w:r>
+              <w:r>
+                <w:rPr>
+                  <w:rStyle w:val="Hyperlink"/>
+                  <w:rFonts w:ascii="Aptos" w:hAnsi="Aptos"/>
+                  <w:b w:val="0"/>
+                  <w:color w:val="0563C1"/>
+                  <w:sz w:val="19"/>
+                  <w:u w:val="single"/>
+                </w:rPr>
+                <w:t>Site/theory</w:t>
+              </w:r>
+            </w:hyperlink>
           </w:p>
         </w:tc>
         <w:tc>
@@ -5488,16 +5831,26 @@
               <w:spacing w:before="0" w:after="0" w:line="240" w:lineRule="auto"/>
               <w:jc w:val="left"/>
             </w:pPr>
-            <w:r/>
-            <w:r>
-              <w:rPr>
-                <w:rFonts w:ascii="Aptos" w:hAnsi="Aptos"/>
-                <w:b w:val="0"/>
-                <w:color w:val="243229"/>
-                <w:sz w:val="19"/>
-              </w:rPr>
-              <w:t>Food safety controls from farm to fridge</w:t>
-            </w:r>
+            <w:hyperlink r:id="rId34">
+              <w:r>
+                <w:rPr>
+                  <w:rStyle w:val="Hyperlink"/>
+                  <w:color w:val="0563C1"/>
+                  <w:u w:val="single"/>
+                </w:rPr>
+              </w:r>
+              <w:r>
+                <w:rPr>
+                  <w:rStyle w:val="Hyperlink"/>
+                  <w:rFonts w:ascii="Aptos" w:hAnsi="Aptos"/>
+                  <w:b w:val="0"/>
+                  <w:color w:val="0563C1"/>
+                  <w:sz w:val="19"/>
+                  <w:u w:val="single"/>
+                </w:rPr>
+                <w:t>Food safety controls from farm to fridge</w:t>
+              </w:r>
+            </w:hyperlink>
           </w:p>
         </w:tc>
         <w:tc>
@@ -5605,16 +5958,26 @@
               <w:spacing w:before="0" w:after="0" w:line="240" w:lineRule="auto"/>
               <w:jc w:val="center"/>
             </w:pPr>
-            <w:r/>
-            <w:r>
-              <w:rPr>
-                <w:rFonts w:ascii="Aptos" w:hAnsi="Aptos"/>
-                <w:b w:val="0"/>
-                <w:color w:val="243229"/>
-                <w:sz w:val="19"/>
-              </w:rPr>
-              <w:t>Project/folio</w:t>
-            </w:r>
+            <w:hyperlink r:id="rId35">
+              <w:r>
+                <w:rPr>
+                  <w:rStyle w:val="Hyperlink"/>
+                  <w:color w:val="0563C1"/>
+                  <w:u w:val="single"/>
+                </w:rPr>
+              </w:r>
+              <w:r>
+                <w:rPr>
+                  <w:rStyle w:val="Hyperlink"/>
+                  <w:rFonts w:ascii="Aptos" w:hAnsi="Aptos"/>
+                  <w:b w:val="0"/>
+                  <w:color w:val="0563C1"/>
+                  <w:sz w:val="19"/>
+                  <w:u w:val="single"/>
+                </w:rPr>
+                <w:t>Project/folio</w:t>
+              </w:r>
+            </w:hyperlink>
           </w:p>
         </w:tc>
         <w:tc>
@@ -5628,16 +5991,26 @@
               <w:spacing w:before="0" w:after="0" w:line="240" w:lineRule="auto"/>
               <w:jc w:val="left"/>
             </w:pPr>
-            <w:r/>
-            <w:r>
-              <w:rPr>
-                <w:rFonts w:ascii="Aptos" w:hAnsi="Aptos"/>
-                <w:b w:val="0"/>
-                <w:color w:val="243229"/>
-                <w:sz w:val="19"/>
-              </w:rPr>
-              <w:t>Nutrition information and informed choice</w:t>
-            </w:r>
+            <w:hyperlink r:id="rId36">
+              <w:r>
+                <w:rPr>
+                  <w:rStyle w:val="Hyperlink"/>
+                  <w:color w:val="0563C1"/>
+                  <w:u w:val="single"/>
+                </w:rPr>
+              </w:r>
+              <w:r>
+                <w:rPr>
+                  <w:rStyle w:val="Hyperlink"/>
+                  <w:rFonts w:ascii="Aptos" w:hAnsi="Aptos"/>
+                  <w:b w:val="0"/>
+                  <w:color w:val="0563C1"/>
+                  <w:sz w:val="19"/>
+                  <w:u w:val="single"/>
+                </w:rPr>
+                <w:t>Nutrition information and informed choice</w:t>
+              </w:r>
+            </w:hyperlink>
           </w:p>
         </w:tc>
         <w:tc>
@@ -6026,16 +6399,26 @@
               <w:spacing w:before="0" w:after="0" w:line="240" w:lineRule="auto"/>
               <w:jc w:val="center"/>
             </w:pPr>
-            <w:r/>
-            <w:r>
-              <w:rPr>
-                <w:rFonts w:ascii="Aptos" w:hAnsi="Aptos"/>
-                <w:b w:val="0"/>
-                <w:color w:val="243229"/>
-                <w:sz w:val="19"/>
-              </w:rPr>
-              <w:t>Site/theory</w:t>
-            </w:r>
+            <w:hyperlink r:id="rId37">
+              <w:r>
+                <w:rPr>
+                  <w:rStyle w:val="Hyperlink"/>
+                  <w:color w:val="0563C1"/>
+                  <w:u w:val="single"/>
+                </w:rPr>
+              </w:r>
+              <w:r>
+                <w:rPr>
+                  <w:rStyle w:val="Hyperlink"/>
+                  <w:rFonts w:ascii="Aptos" w:hAnsi="Aptos"/>
+                  <w:b w:val="0"/>
+                  <w:color w:val="0563C1"/>
+                  <w:sz w:val="19"/>
+                  <w:u w:val="single"/>
+                </w:rPr>
+                <w:t>Site/theory</w:t>
+              </w:r>
+            </w:hyperlink>
           </w:p>
         </w:tc>
         <w:tc>
@@ -6048,16 +6431,26 @@
               <w:spacing w:before="0" w:after="0" w:line="240" w:lineRule="auto"/>
               <w:jc w:val="left"/>
             </w:pPr>
-            <w:r/>
-            <w:r>
-              <w:rPr>
-                <w:rFonts w:ascii="Aptos" w:hAnsi="Aptos"/>
-                <w:b w:val="0"/>
-                <w:color w:val="243229"/>
-                <w:sz w:val="19"/>
-              </w:rPr>
-              <w:t>What horticulture includes</w:t>
-            </w:r>
+            <w:hyperlink r:id="rId37">
+              <w:r>
+                <w:rPr>
+                  <w:rStyle w:val="Hyperlink"/>
+                  <w:color w:val="0563C1"/>
+                  <w:u w:val="single"/>
+                </w:rPr>
+              </w:r>
+              <w:r>
+                <w:rPr>
+                  <w:rStyle w:val="Hyperlink"/>
+                  <w:rFonts w:ascii="Aptos" w:hAnsi="Aptos"/>
+                  <w:b w:val="0"/>
+                  <w:color w:val="0563C1"/>
+                  <w:sz w:val="19"/>
+                  <w:u w:val="single"/>
+                </w:rPr>
+                <w:t>What horticulture includes</w:t>
+              </w:r>
+            </w:hyperlink>
           </w:p>
         </w:tc>
         <w:tc>
@@ -6165,16 +6558,26 @@
               <w:spacing w:before="0" w:after="0" w:line="240" w:lineRule="auto"/>
               <w:jc w:val="center"/>
             </w:pPr>
-            <w:r/>
-            <w:r>
-              <w:rPr>
-                <w:rFonts w:ascii="Aptos" w:hAnsi="Aptos"/>
-                <w:b w:val="0"/>
-                <w:color w:val="243229"/>
-                <w:sz w:val="19"/>
-              </w:rPr>
-              <w:t>Site/theory</w:t>
-            </w:r>
+            <w:hyperlink r:id="rId38">
+              <w:r>
+                <w:rPr>
+                  <w:rStyle w:val="Hyperlink"/>
+                  <w:color w:val="0563C1"/>
+                  <w:u w:val="single"/>
+                </w:rPr>
+              </w:r>
+              <w:r>
+                <w:rPr>
+                  <w:rStyle w:val="Hyperlink"/>
+                  <w:rFonts w:ascii="Aptos" w:hAnsi="Aptos"/>
+                  <w:b w:val="0"/>
+                  <w:color w:val="0563C1"/>
+                  <w:sz w:val="19"/>
+                  <w:u w:val="single"/>
+                </w:rPr>
+                <w:t>Site/theory</w:t>
+              </w:r>
+            </w:hyperlink>
           </w:p>
         </w:tc>
         <w:tc>
@@ -6188,16 +6591,26 @@
               <w:spacing w:before="0" w:after="0" w:line="240" w:lineRule="auto"/>
               <w:jc w:val="left"/>
             </w:pPr>
-            <w:r/>
-            <w:r>
-              <w:rPr>
-                <w:rFonts w:ascii="Aptos" w:hAnsi="Aptos"/>
-                <w:b w:val="0"/>
-                <w:color w:val="243229"/>
-                <w:sz w:val="19"/>
-              </w:rPr>
-              <w:t>Why crops suit particular regions</w:t>
-            </w:r>
+            <w:hyperlink r:id="rId38">
+              <w:r>
+                <w:rPr>
+                  <w:rStyle w:val="Hyperlink"/>
+                  <w:color w:val="0563C1"/>
+                  <w:u w:val="single"/>
+                </w:rPr>
+              </w:r>
+              <w:r>
+                <w:rPr>
+                  <w:rStyle w:val="Hyperlink"/>
+                  <w:rFonts w:ascii="Aptos" w:hAnsi="Aptos"/>
+                  <w:b w:val="0"/>
+                  <w:color w:val="0563C1"/>
+                  <w:sz w:val="19"/>
+                  <w:u w:val="single"/>
+                </w:rPr>
+                <w:t>Why crops suit particular regions</w:t>
+              </w:r>
+            </w:hyperlink>
           </w:p>
         </w:tc>
         <w:tc>
@@ -6507,16 +6920,26 @@
               <w:spacing w:before="0" w:after="0" w:line="240" w:lineRule="auto"/>
               <w:jc w:val="center"/>
             </w:pPr>
-            <w:r/>
-            <w:r>
-              <w:rPr>
-                <w:rFonts w:ascii="Aptos" w:hAnsi="Aptos"/>
-                <w:b w:val="0"/>
-                <w:color w:val="243229"/>
-                <w:sz w:val="19"/>
-              </w:rPr>
-              <w:t>Project/folio</w:t>
-            </w:r>
+            <w:hyperlink r:id="rId39">
+              <w:r>
+                <w:rPr>
+                  <w:rStyle w:val="Hyperlink"/>
+                  <w:color w:val="0563C1"/>
+                  <w:u w:val="single"/>
+                </w:rPr>
+              </w:r>
+              <w:r>
+                <w:rPr>
+                  <w:rStyle w:val="Hyperlink"/>
+                  <w:rFonts w:ascii="Aptos" w:hAnsi="Aptos"/>
+                  <w:b w:val="0"/>
+                  <w:color w:val="0563C1"/>
+                  <w:sz w:val="19"/>
+                  <w:u w:val="single"/>
+                </w:rPr>
+                <w:t>Project/folio</w:t>
+              </w:r>
+            </w:hyperlink>
           </w:p>
         </w:tc>
         <w:tc>
@@ -6529,16 +6952,26 @@
               <w:spacing w:before="0" w:after="0" w:line="240" w:lineRule="auto"/>
               <w:jc w:val="left"/>
             </w:pPr>
-            <w:r/>
-            <w:r>
-              <w:rPr>
-                <w:rFonts w:ascii="Aptos" w:hAnsi="Aptos"/>
-                <w:b w:val="0"/>
-                <w:color w:val="243229"/>
-                <w:sz w:val="19"/>
-              </w:rPr>
-              <w:t>Seasonality, markets and production decisions</w:t>
-            </w:r>
+            <w:hyperlink r:id="rId40">
+              <w:r>
+                <w:rPr>
+                  <w:rStyle w:val="Hyperlink"/>
+                  <w:color w:val="0563C1"/>
+                  <w:u w:val="single"/>
+                </w:rPr>
+              </w:r>
+              <w:r>
+                <w:rPr>
+                  <w:rStyle w:val="Hyperlink"/>
+                  <w:rFonts w:ascii="Aptos" w:hAnsi="Aptos"/>
+                  <w:b w:val="0"/>
+                  <w:color w:val="0563C1"/>
+                  <w:sz w:val="19"/>
+                  <w:u w:val="single"/>
+                </w:rPr>
+                <w:t>Seasonality, markets and production decisions</w:t>
+              </w:r>
+            </w:hyperlink>
           </w:p>
         </w:tc>
         <w:tc>
@@ -6787,16 +7220,26 @@
               <w:spacing w:before="0" w:after="0" w:line="240" w:lineRule="auto"/>
               <w:jc w:val="center"/>
             </w:pPr>
-            <w:r/>
-            <w:r>
-              <w:rPr>
-                <w:rFonts w:ascii="Aptos" w:hAnsi="Aptos"/>
-                <w:b w:val="0"/>
-                <w:color w:val="243229"/>
-                <w:sz w:val="19"/>
-              </w:rPr>
-              <w:t>Site/theory</w:t>
-            </w:r>
+            <w:hyperlink r:id="rId41">
+              <w:r>
+                <w:rPr>
+                  <w:rStyle w:val="Hyperlink"/>
+                  <w:color w:val="0563C1"/>
+                  <w:u w:val="single"/>
+                </w:rPr>
+              </w:r>
+              <w:r>
+                <w:rPr>
+                  <w:rStyle w:val="Hyperlink"/>
+                  <w:rFonts w:ascii="Aptos" w:hAnsi="Aptos"/>
+                  <w:b w:val="0"/>
+                  <w:color w:val="0563C1"/>
+                  <w:sz w:val="19"/>
+                  <w:u w:val="single"/>
+                </w:rPr>
+                <w:t>Site/theory</w:t>
+              </w:r>
+            </w:hyperlink>
           </w:p>
         </w:tc>
         <w:tc>
@@ -6809,16 +7252,26 @@
               <w:spacing w:before="0" w:after="0" w:line="240" w:lineRule="auto"/>
               <w:jc w:val="left"/>
             </w:pPr>
-            <w:r/>
-            <w:r>
-              <w:rPr>
-                <w:rFonts w:ascii="Aptos" w:hAnsi="Aptos"/>
-                <w:b w:val="0"/>
-                <w:color w:val="243229"/>
-                <w:sz w:val="19"/>
-              </w:rPr>
-              <w:t>Tracing a horticultural product from paddock to plate</w:t>
-            </w:r>
+            <w:hyperlink r:id="rId41">
+              <w:r>
+                <w:rPr>
+                  <w:rStyle w:val="Hyperlink"/>
+                  <w:color w:val="0563C1"/>
+                  <w:u w:val="single"/>
+                </w:rPr>
+              </w:r>
+              <w:r>
+                <w:rPr>
+                  <w:rStyle w:val="Hyperlink"/>
+                  <w:rFonts w:ascii="Aptos" w:hAnsi="Aptos"/>
+                  <w:b w:val="0"/>
+                  <w:color w:val="0563C1"/>
+                  <w:sz w:val="19"/>
+                  <w:u w:val="single"/>
+                </w:rPr>
+                <w:t>Tracing a horticultural product from paddock to plate</w:t>
+              </w:r>
+            </w:hyperlink>
           </w:p>
         </w:tc>
         <w:tc>
@@ -6926,16 +7379,26 @@
               <w:spacing w:before="0" w:after="0" w:line="240" w:lineRule="auto"/>
               <w:jc w:val="center"/>
             </w:pPr>
-            <w:r/>
-            <w:r>
-              <w:rPr>
-                <w:rFonts w:ascii="Aptos" w:hAnsi="Aptos"/>
-                <w:b w:val="0"/>
-                <w:color w:val="243229"/>
-                <w:sz w:val="19"/>
-              </w:rPr>
-              <w:t>Site/theory</w:t>
-            </w:r>
+            <w:hyperlink r:id="rId42">
+              <w:r>
+                <w:rPr>
+                  <w:rStyle w:val="Hyperlink"/>
+                  <w:color w:val="0563C1"/>
+                  <w:u w:val="single"/>
+                </w:rPr>
+              </w:r>
+              <w:r>
+                <w:rPr>
+                  <w:rStyle w:val="Hyperlink"/>
+                  <w:rFonts w:ascii="Aptos" w:hAnsi="Aptos"/>
+                  <w:b w:val="0"/>
+                  <w:color w:val="0563C1"/>
+                  <w:sz w:val="19"/>
+                  <w:u w:val="single"/>
+                </w:rPr>
+                <w:t>Site/theory</w:t>
+              </w:r>
+            </w:hyperlink>
           </w:p>
         </w:tc>
         <w:tc>
@@ -6949,16 +7412,26 @@
               <w:spacing w:before="0" w:after="0" w:line="240" w:lineRule="auto"/>
               <w:jc w:val="left"/>
             </w:pPr>
-            <w:r/>
-            <w:r>
-              <w:rPr>
-                <w:rFonts w:ascii="Aptos" w:hAnsi="Aptos"/>
-                <w:b w:val="0"/>
-                <w:color w:val="243229"/>
-                <w:sz w:val="19"/>
-              </w:rPr>
-              <w:t>Sensors, robotics and precision decisions</w:t>
-            </w:r>
+            <w:hyperlink r:id="rId42">
+              <w:r>
+                <w:rPr>
+                  <w:rStyle w:val="Hyperlink"/>
+                  <w:color w:val="0563C1"/>
+                  <w:u w:val="single"/>
+                </w:rPr>
+              </w:r>
+              <w:r>
+                <w:rPr>
+                  <w:rStyle w:val="Hyperlink"/>
+                  <w:rFonts w:ascii="Aptos" w:hAnsi="Aptos"/>
+                  <w:b w:val="0"/>
+                  <w:color w:val="0563C1"/>
+                  <w:sz w:val="19"/>
+                  <w:u w:val="single"/>
+                </w:rPr>
+                <w:t>Sensors, robotics and precision decisions</w:t>
+              </w:r>
+            </w:hyperlink>
           </w:p>
         </w:tc>
         <w:tc>
@@ -7067,16 +7540,26 @@
               <w:spacing w:before="0" w:after="0" w:line="240" w:lineRule="auto"/>
               <w:jc w:val="center"/>
             </w:pPr>
-            <w:r/>
-            <w:r>
-              <w:rPr>
-                <w:rFonts w:ascii="Aptos" w:hAnsi="Aptos"/>
-                <w:b w:val="0"/>
-                <w:color w:val="243229"/>
-                <w:sz w:val="19"/>
-              </w:rPr>
-              <w:t>Project/folio</w:t>
-            </w:r>
+            <w:hyperlink r:id="rId43">
+              <w:r>
+                <w:rPr>
+                  <w:rStyle w:val="Hyperlink"/>
+                  <w:color w:val="0563C1"/>
+                  <w:u w:val="single"/>
+                </w:rPr>
+              </w:r>
+              <w:r>
+                <w:rPr>
+                  <w:rStyle w:val="Hyperlink"/>
+                  <w:rFonts w:ascii="Aptos" w:hAnsi="Aptos"/>
+                  <w:b w:val="0"/>
+                  <w:color w:val="0563C1"/>
+                  <w:sz w:val="19"/>
+                  <w:u w:val="single"/>
+                </w:rPr>
+                <w:t>Project/folio</w:t>
+              </w:r>
+            </w:hyperlink>
           </w:p>
         </w:tc>
         <w:tc>
@@ -7089,16 +7572,26 @@
               <w:spacing w:before="0" w:after="0" w:line="240" w:lineRule="auto"/>
               <w:jc w:val="left"/>
             </w:pPr>
-            <w:r/>
-            <w:r>
-              <w:rPr>
-                <w:rFonts w:ascii="Aptos" w:hAnsi="Aptos"/>
-                <w:b w:val="0"/>
-                <w:color w:val="243229"/>
-                <w:sz w:val="19"/>
-              </w:rPr>
-              <w:t>Plant parts, food labels and balanced choices</w:t>
-            </w:r>
+            <w:hyperlink r:id="rId44">
+              <w:r>
+                <w:rPr>
+                  <w:rStyle w:val="Hyperlink"/>
+                  <w:color w:val="0563C1"/>
+                  <w:u w:val="single"/>
+                </w:rPr>
+              </w:r>
+              <w:r>
+                <w:rPr>
+                  <w:rStyle w:val="Hyperlink"/>
+                  <w:rFonts w:ascii="Aptos" w:hAnsi="Aptos"/>
+                  <w:b w:val="0"/>
+                  <w:color w:val="0563C1"/>
+                  <w:sz w:val="19"/>
+                  <w:u w:val="single"/>
+                </w:rPr>
+                <w:t>Plant parts, food labels and balanced choices</w:t>
+              </w:r>
+            </w:hyperlink>
           </w:p>
         </w:tc>
         <w:tc>
@@ -7347,16 +7840,26 @@
               <w:spacing w:before="0" w:after="0" w:line="240" w:lineRule="auto"/>
               <w:jc w:val="center"/>
             </w:pPr>
-            <w:r/>
-            <w:r>
-              <w:rPr>
-                <w:rFonts w:ascii="Aptos" w:hAnsi="Aptos"/>
-                <w:b w:val="0"/>
-                <w:color w:val="243229"/>
-                <w:sz w:val="19"/>
-              </w:rPr>
-              <w:t>Site/theory</w:t>
-            </w:r>
+            <w:hyperlink r:id="rId45">
+              <w:r>
+                <w:rPr>
+                  <w:rStyle w:val="Hyperlink"/>
+                  <w:color w:val="0563C1"/>
+                  <w:u w:val="single"/>
+                </w:rPr>
+              </w:r>
+              <w:r>
+                <w:rPr>
+                  <w:rStyle w:val="Hyperlink"/>
+                  <w:rFonts w:ascii="Aptos" w:hAnsi="Aptos"/>
+                  <w:b w:val="0"/>
+                  <w:color w:val="0563C1"/>
+                  <w:sz w:val="19"/>
+                  <w:u w:val="single"/>
+                </w:rPr>
+                <w:t>Site/theory</w:t>
+              </w:r>
+            </w:hyperlink>
           </w:p>
         </w:tc>
         <w:tc>
@@ -7369,16 +7872,26 @@
               <w:spacing w:before="0" w:after="0" w:line="240" w:lineRule="auto"/>
               <w:jc w:val="left"/>
             </w:pPr>
-            <w:r/>
-            <w:r>
-              <w:rPr>
-                <w:rFonts w:ascii="Aptos" w:hAnsi="Aptos"/>
-                <w:b w:val="0"/>
-                <w:color w:val="243229"/>
-                <w:sz w:val="19"/>
-              </w:rPr>
-              <w:t>Pork products and value adding</w:t>
-            </w:r>
+            <w:hyperlink r:id="rId45">
+              <w:r>
+                <w:rPr>
+                  <w:rStyle w:val="Hyperlink"/>
+                  <w:color w:val="0563C1"/>
+                  <w:u w:val="single"/>
+                </w:rPr>
+              </w:r>
+              <w:r>
+                <w:rPr>
+                  <w:rStyle w:val="Hyperlink"/>
+                  <w:rFonts w:ascii="Aptos" w:hAnsi="Aptos"/>
+                  <w:b w:val="0"/>
+                  <w:color w:val="0563C1"/>
+                  <w:sz w:val="19"/>
+                  <w:u w:val="single"/>
+                </w:rPr>
+                <w:t>Pork products and value adding</w:t>
+              </w:r>
+            </w:hyperlink>
           </w:p>
         </w:tc>
         <w:tc>
@@ -7486,16 +7999,26 @@
               <w:spacing w:before="0" w:after="0" w:line="240" w:lineRule="auto"/>
               <w:jc w:val="center"/>
             </w:pPr>
-            <w:r/>
-            <w:r>
-              <w:rPr>
-                <w:rFonts w:ascii="Aptos" w:hAnsi="Aptos"/>
-                <w:b w:val="0"/>
-                <w:color w:val="243229"/>
-                <w:sz w:val="19"/>
-              </w:rPr>
-              <w:t>Site/theory</w:t>
-            </w:r>
+            <w:hyperlink r:id="rId46">
+              <w:r>
+                <w:rPr>
+                  <w:rStyle w:val="Hyperlink"/>
+                  <w:color w:val="0563C1"/>
+                  <w:u w:val="single"/>
+                </w:rPr>
+              </w:r>
+              <w:r>
+                <w:rPr>
+                  <w:rStyle w:val="Hyperlink"/>
+                  <w:rFonts w:ascii="Aptos" w:hAnsi="Aptos"/>
+                  <w:b w:val="0"/>
+                  <w:color w:val="0563C1"/>
+                  <w:sz w:val="19"/>
+                  <w:u w:val="single"/>
+                </w:rPr>
+                <w:t>Site/theory</w:t>
+              </w:r>
+            </w:hyperlink>
           </w:p>
         </w:tc>
         <w:tc>
@@ -7509,16 +8032,26 @@
               <w:spacing w:before="0" w:after="0" w:line="240" w:lineRule="auto"/>
               <w:jc w:val="left"/>
             </w:pPr>
-            <w:r/>
-            <w:r>
-              <w:rPr>
-                <w:rFonts w:ascii="Aptos" w:hAnsi="Aptos"/>
-                <w:b w:val="0"/>
-                <w:color w:val="243229"/>
-                <w:sz w:val="19"/>
-              </w:rPr>
-              <w:t>Reading country-of-origin evidence</w:t>
-            </w:r>
+            <w:hyperlink r:id="rId46">
+              <w:r>
+                <w:rPr>
+                  <w:rStyle w:val="Hyperlink"/>
+                  <w:color w:val="0563C1"/>
+                  <w:u w:val="single"/>
+                </w:rPr>
+              </w:r>
+              <w:r>
+                <w:rPr>
+                  <w:rStyle w:val="Hyperlink"/>
+                  <w:rFonts w:ascii="Aptos" w:hAnsi="Aptos"/>
+                  <w:b w:val="0"/>
+                  <w:color w:val="0563C1"/>
+                  <w:sz w:val="19"/>
+                  <w:u w:val="single"/>
+                </w:rPr>
+                <w:t>Reading country-of-origin evidence</w:t>
+              </w:r>
+            </w:hyperlink>
           </w:p>
         </w:tc>
         <w:tc>
@@ -7828,16 +8361,26 @@
               <w:spacing w:before="0" w:after="0" w:line="240" w:lineRule="auto"/>
               <w:jc w:val="center"/>
             </w:pPr>
-            <w:r/>
-            <w:r>
-              <w:rPr>
-                <w:rFonts w:ascii="Aptos" w:hAnsi="Aptos"/>
-                <w:b w:val="0"/>
-                <w:color w:val="243229"/>
-                <w:sz w:val="19"/>
-              </w:rPr>
-              <w:t>Project/folio</w:t>
-            </w:r>
+            <w:hyperlink r:id="rId47">
+              <w:r>
+                <w:rPr>
+                  <w:rStyle w:val="Hyperlink"/>
+                  <w:color w:val="0563C1"/>
+                  <w:u w:val="single"/>
+                </w:rPr>
+              </w:r>
+              <w:r>
+                <w:rPr>
+                  <w:rStyle w:val="Hyperlink"/>
+                  <w:rFonts w:ascii="Aptos" w:hAnsi="Aptos"/>
+                  <w:b w:val="0"/>
+                  <w:color w:val="0563C1"/>
+                  <w:sz w:val="19"/>
+                  <w:u w:val="single"/>
+                </w:rPr>
+                <w:t>Project/folio</w:t>
+              </w:r>
+            </w:hyperlink>
           </w:p>
         </w:tc>
         <w:tc>
@@ -7850,16 +8393,26 @@
               <w:spacing w:before="0" w:after="0" w:line="240" w:lineRule="auto"/>
               <w:jc w:val="left"/>
             </w:pPr>
-            <w:r/>
-            <w:r>
-              <w:rPr>
-                <w:rFonts w:ascii="Aptos" w:hAnsi="Aptos"/>
-                <w:b w:val="0"/>
-                <w:color w:val="243229"/>
-                <w:sz w:val="19"/>
-              </w:rPr>
-              <w:t>Breed traits, crossbreeding and evidence</w:t>
-            </w:r>
+            <w:hyperlink r:id="rId48">
+              <w:r>
+                <w:rPr>
+                  <w:rStyle w:val="Hyperlink"/>
+                  <w:color w:val="0563C1"/>
+                  <w:u w:val="single"/>
+                </w:rPr>
+              </w:r>
+              <w:r>
+                <w:rPr>
+                  <w:rStyle w:val="Hyperlink"/>
+                  <w:rFonts w:ascii="Aptos" w:hAnsi="Aptos"/>
+                  <w:b w:val="0"/>
+                  <w:color w:val="0563C1"/>
+                  <w:sz w:val="19"/>
+                  <w:u w:val="single"/>
+                </w:rPr>
+                <w:t>Breed traits, crossbreeding and evidence</w:t>
+              </w:r>
+            </w:hyperlink>
           </w:p>
         </w:tc>
         <w:tc>
@@ -8108,16 +8661,26 @@
               <w:spacing w:before="0" w:after="0" w:line="240" w:lineRule="auto"/>
               <w:jc w:val="center"/>
             </w:pPr>
-            <w:r/>
-            <w:r>
-              <w:rPr>
-                <w:rFonts w:ascii="Aptos" w:hAnsi="Aptos"/>
-                <w:b w:val="0"/>
-                <w:color w:val="243229"/>
-                <w:sz w:val="19"/>
-              </w:rPr>
-              <w:t>Site/theory</w:t>
-            </w:r>
+            <w:hyperlink r:id="rId49">
+              <w:r>
+                <w:rPr>
+                  <w:rStyle w:val="Hyperlink"/>
+                  <w:color w:val="0563C1"/>
+                  <w:u w:val="single"/>
+                </w:rPr>
+              </w:r>
+              <w:r>
+                <w:rPr>
+                  <w:rStyle w:val="Hyperlink"/>
+                  <w:rFonts w:ascii="Aptos" w:hAnsi="Aptos"/>
+                  <w:b w:val="0"/>
+                  <w:color w:val="0563C1"/>
+                  <w:sz w:val="19"/>
+                  <w:u w:val="single"/>
+                </w:rPr>
+                <w:t>Site/theory</w:t>
+              </w:r>
+            </w:hyperlink>
           </w:p>
         </w:tc>
         <w:tc>
@@ -8130,16 +8693,26 @@
               <w:spacing w:before="0" w:after="0" w:line="240" w:lineRule="auto"/>
               <w:jc w:val="left"/>
             </w:pPr>
-            <w:r/>
-            <w:r>
-              <w:rPr>
-                <w:rFonts w:ascii="Aptos" w:hAnsi="Aptos"/>
-                <w:b w:val="0"/>
-                <w:color w:val="243229"/>
-                <w:sz w:val="19"/>
-              </w:rPr>
-              <w:t>Comparing pig housing systems</w:t>
-            </w:r>
+            <w:hyperlink r:id="rId49">
+              <w:r>
+                <w:rPr>
+                  <w:rStyle w:val="Hyperlink"/>
+                  <w:color w:val="0563C1"/>
+                  <w:u w:val="single"/>
+                </w:rPr>
+              </w:r>
+              <w:r>
+                <w:rPr>
+                  <w:rStyle w:val="Hyperlink"/>
+                  <w:rFonts w:ascii="Aptos" w:hAnsi="Aptos"/>
+                  <w:b w:val="0"/>
+                  <w:color w:val="0563C1"/>
+                  <w:sz w:val="19"/>
+                  <w:u w:val="single"/>
+                </w:rPr>
+                <w:t>Comparing pig housing systems</w:t>
+              </w:r>
+            </w:hyperlink>
           </w:p>
         </w:tc>
         <w:tc>
@@ -8247,16 +8820,26 @@
               <w:spacing w:before="0" w:after="0" w:line="240" w:lineRule="auto"/>
               <w:jc w:val="center"/>
             </w:pPr>
-            <w:r/>
-            <w:r>
-              <w:rPr>
-                <w:rFonts w:ascii="Aptos" w:hAnsi="Aptos"/>
-                <w:b w:val="0"/>
-                <w:color w:val="243229"/>
-                <w:sz w:val="19"/>
-              </w:rPr>
-              <w:t>Site/theory</w:t>
-            </w:r>
+            <w:hyperlink r:id="rId50">
+              <w:r>
+                <w:rPr>
+                  <w:rStyle w:val="Hyperlink"/>
+                  <w:color w:val="0563C1"/>
+                  <w:u w:val="single"/>
+                </w:rPr>
+              </w:r>
+              <w:r>
+                <w:rPr>
+                  <w:rStyle w:val="Hyperlink"/>
+                  <w:rFonts w:ascii="Aptos" w:hAnsi="Aptos"/>
+                  <w:b w:val="0"/>
+                  <w:color w:val="0563C1"/>
+                  <w:sz w:val="19"/>
+                  <w:u w:val="single"/>
+                </w:rPr>
+                <w:t>Site/theory</w:t>
+              </w:r>
+            </w:hyperlink>
           </w:p>
         </w:tc>
         <w:tc>
@@ -8270,16 +8853,26 @@
               <w:spacing w:before="0" w:after="0" w:line="240" w:lineRule="auto"/>
               <w:jc w:val="left"/>
             </w:pPr>
-            <w:r/>
-            <w:r>
-              <w:rPr>
-                <w:rFonts w:ascii="Aptos" w:hAnsi="Aptos"/>
-                <w:b w:val="0"/>
-                <w:color w:val="243229"/>
-                <w:sz w:val="19"/>
-              </w:rPr>
-              <w:t>Feed, growth and production goals</w:t>
-            </w:r>
+            <w:hyperlink r:id="rId50">
+              <w:r>
+                <w:rPr>
+                  <w:rStyle w:val="Hyperlink"/>
+                  <w:color w:val="0563C1"/>
+                  <w:u w:val="single"/>
+                </w:rPr>
+              </w:r>
+              <w:r>
+                <w:rPr>
+                  <w:rStyle w:val="Hyperlink"/>
+                  <w:rFonts w:ascii="Aptos" w:hAnsi="Aptos"/>
+                  <w:b w:val="0"/>
+                  <w:color w:val="0563C1"/>
+                  <w:sz w:val="19"/>
+                  <w:u w:val="single"/>
+                </w:rPr>
+                <w:t>Feed, growth and production goals</w:t>
+              </w:r>
+            </w:hyperlink>
           </w:p>
         </w:tc>
         <w:tc>
@@ -8388,16 +8981,26 @@
               <w:spacing w:before="0" w:after="0" w:line="240" w:lineRule="auto"/>
               <w:jc w:val="center"/>
             </w:pPr>
-            <w:r/>
-            <w:r>
-              <w:rPr>
-                <w:rFonts w:ascii="Aptos" w:hAnsi="Aptos"/>
-                <w:b w:val="0"/>
-                <w:color w:val="243229"/>
-                <w:sz w:val="19"/>
-              </w:rPr>
-              <w:t>Project/folio</w:t>
-            </w:r>
+            <w:hyperlink r:id="rId51">
+              <w:r>
+                <w:rPr>
+                  <w:rStyle w:val="Hyperlink"/>
+                  <w:color w:val="0563C1"/>
+                  <w:u w:val="single"/>
+                </w:rPr>
+              </w:r>
+              <w:r>
+                <w:rPr>
+                  <w:rStyle w:val="Hyperlink"/>
+                  <w:rFonts w:ascii="Aptos" w:hAnsi="Aptos"/>
+                  <w:b w:val="0"/>
+                  <w:color w:val="0563C1"/>
+                  <w:sz w:val="19"/>
+                  <w:u w:val="single"/>
+                </w:rPr>
+                <w:t>Project/folio</w:t>
+              </w:r>
+            </w:hyperlink>
           </w:p>
         </w:tc>
         <w:tc>
@@ -8410,16 +9013,26 @@
               <w:spacing w:before="0" w:after="0" w:line="240" w:lineRule="auto"/>
               <w:jc w:val="left"/>
             </w:pPr>
-            <w:r/>
-            <w:r>
-              <w:rPr>
-                <w:rFonts w:ascii="Aptos" w:hAnsi="Aptos"/>
-                <w:b w:val="0"/>
-                <w:color w:val="243229"/>
-                <w:sz w:val="19"/>
-              </w:rPr>
-              <w:t>Welfare evidence and defensible choices</w:t>
-            </w:r>
+            <w:hyperlink r:id="rId52">
+              <w:r>
+                <w:rPr>
+                  <w:rStyle w:val="Hyperlink"/>
+                  <w:color w:val="0563C1"/>
+                  <w:u w:val="single"/>
+                </w:rPr>
+              </w:r>
+              <w:r>
+                <w:rPr>
+                  <w:rStyle w:val="Hyperlink"/>
+                  <w:rFonts w:ascii="Aptos" w:hAnsi="Aptos"/>
+                  <w:b w:val="0"/>
+                  <w:color w:val="0563C1"/>
+                  <w:sz w:val="19"/>
+                  <w:u w:val="single"/>
+                </w:rPr>
+                <w:t>Welfare evidence and defensible choices</w:t>
+              </w:r>
+            </w:hyperlink>
           </w:p>
         </w:tc>
         <w:tc>
@@ -8668,16 +9281,26 @@
               <w:spacing w:before="0" w:after="0" w:line="240" w:lineRule="auto"/>
               <w:jc w:val="center"/>
             </w:pPr>
-            <w:r/>
-            <w:r>
-              <w:rPr>
-                <w:rFonts w:ascii="Aptos" w:hAnsi="Aptos"/>
-                <w:b w:val="0"/>
-                <w:color w:val="243229"/>
-                <w:sz w:val="19"/>
-              </w:rPr>
-              <w:t>Site/theory</w:t>
-            </w:r>
+            <w:hyperlink r:id="rId53">
+              <w:r>
+                <w:rPr>
+                  <w:rStyle w:val="Hyperlink"/>
+                  <w:color w:val="0563C1"/>
+                  <w:u w:val="single"/>
+                </w:rPr>
+              </w:r>
+              <w:r>
+                <w:rPr>
+                  <w:rStyle w:val="Hyperlink"/>
+                  <w:rFonts w:ascii="Aptos" w:hAnsi="Aptos"/>
+                  <w:b w:val="0"/>
+                  <w:color w:val="0563C1"/>
+                  <w:sz w:val="19"/>
+                  <w:u w:val="single"/>
+                </w:rPr>
+                <w:t>Site/theory</w:t>
+              </w:r>
+            </w:hyperlink>
           </w:p>
         </w:tc>
         <w:tc>
@@ -8690,16 +9313,26 @@
               <w:spacing w:before="0" w:after="0" w:line="240" w:lineRule="auto"/>
               <w:jc w:val="left"/>
             </w:pPr>
-            <w:r/>
-            <w:r>
-              <w:rPr>
-                <w:rFonts w:ascii="Aptos" w:hAnsi="Aptos"/>
-                <w:b w:val="0"/>
-                <w:color w:val="243229"/>
-                <w:sz w:val="19"/>
-              </w:rPr>
-              <w:t>Poultry, broilers and layers</w:t>
-            </w:r>
+            <w:hyperlink r:id="rId53">
+              <w:r>
+                <w:rPr>
+                  <w:rStyle w:val="Hyperlink"/>
+                  <w:color w:val="0563C1"/>
+                  <w:u w:val="single"/>
+                </w:rPr>
+              </w:r>
+              <w:r>
+                <w:rPr>
+                  <w:rStyle w:val="Hyperlink"/>
+                  <w:rFonts w:ascii="Aptos" w:hAnsi="Aptos"/>
+                  <w:b w:val="0"/>
+                  <w:color w:val="0563C1"/>
+                  <w:sz w:val="19"/>
+                  <w:u w:val="single"/>
+                </w:rPr>
+                <w:t>Poultry, broilers and layers</w:t>
+              </w:r>
+            </w:hyperlink>
           </w:p>
         </w:tc>
         <w:tc>
@@ -8807,16 +9440,26 @@
               <w:spacing w:before="0" w:after="0" w:line="240" w:lineRule="auto"/>
               <w:jc w:val="center"/>
             </w:pPr>
-            <w:r/>
-            <w:r>
-              <w:rPr>
-                <w:rFonts w:ascii="Aptos" w:hAnsi="Aptos"/>
-                <w:b w:val="0"/>
-                <w:color w:val="243229"/>
-                <w:sz w:val="19"/>
-              </w:rPr>
-              <w:t>Site/theory</w:t>
-            </w:r>
+            <w:hyperlink r:id="rId54">
+              <w:r>
+                <w:rPr>
+                  <w:rStyle w:val="Hyperlink"/>
+                  <w:color w:val="0563C1"/>
+                  <w:u w:val="single"/>
+                </w:rPr>
+              </w:r>
+              <w:r>
+                <w:rPr>
+                  <w:rStyle w:val="Hyperlink"/>
+                  <w:rFonts w:ascii="Aptos" w:hAnsi="Aptos"/>
+                  <w:b w:val="0"/>
+                  <w:color w:val="0563C1"/>
+                  <w:sz w:val="19"/>
+                  <w:u w:val="single"/>
+                </w:rPr>
+                <w:t>Site/theory</w:t>
+              </w:r>
+            </w:hyperlink>
           </w:p>
         </w:tc>
         <w:tc>
@@ -8830,16 +9473,26 @@
               <w:spacing w:before="0" w:after="0" w:line="240" w:lineRule="auto"/>
               <w:jc w:val="left"/>
             </w:pPr>
-            <w:r/>
-            <w:r>
-              <w:rPr>
-                <w:rFonts w:ascii="Aptos" w:hAnsi="Aptos"/>
-                <w:b w:val="0"/>
-                <w:color w:val="243229"/>
-                <w:sz w:val="19"/>
-              </w:rPr>
-              <w:t>A poultry supply chain and location decisions</w:t>
-            </w:r>
+            <w:hyperlink r:id="rId54">
+              <w:r>
+                <w:rPr>
+                  <w:rStyle w:val="Hyperlink"/>
+                  <w:color w:val="0563C1"/>
+                  <w:u w:val="single"/>
+                </w:rPr>
+              </w:r>
+              <w:r>
+                <w:rPr>
+                  <w:rStyle w:val="Hyperlink"/>
+                  <w:rFonts w:ascii="Aptos" w:hAnsi="Aptos"/>
+                  <w:b w:val="0"/>
+                  <w:color w:val="0563C1"/>
+                  <w:sz w:val="19"/>
+                  <w:u w:val="single"/>
+                </w:rPr>
+                <w:t>A poultry supply chain and location decisions</w:t>
+              </w:r>
+            </w:hyperlink>
           </w:p>
         </w:tc>
         <w:tc>
@@ -9149,16 +9802,26 @@
               <w:spacing w:before="0" w:after="0" w:line="240" w:lineRule="auto"/>
               <w:jc w:val="center"/>
             </w:pPr>
-            <w:r/>
-            <w:r>
-              <w:rPr>
-                <w:rFonts w:ascii="Aptos" w:hAnsi="Aptos"/>
-                <w:b w:val="0"/>
-                <w:color w:val="243229"/>
-                <w:sz w:val="19"/>
-              </w:rPr>
-              <w:t>Project/folio</w:t>
-            </w:r>
+            <w:hyperlink r:id="rId55">
+              <w:r>
+                <w:rPr>
+                  <w:rStyle w:val="Hyperlink"/>
+                  <w:color w:val="0563C1"/>
+                  <w:u w:val="single"/>
+                </w:rPr>
+              </w:r>
+              <w:r>
+                <w:rPr>
+                  <w:rStyle w:val="Hyperlink"/>
+                  <w:rFonts w:ascii="Aptos" w:hAnsi="Aptos"/>
+                  <w:b w:val="0"/>
+                  <w:color w:val="0563C1"/>
+                  <w:sz w:val="19"/>
+                  <w:u w:val="single"/>
+                </w:rPr>
+                <w:t>Project/folio</w:t>
+              </w:r>
+            </w:hyperlink>
           </w:p>
         </w:tc>
         <w:tc>
@@ -9171,16 +9834,26 @@
               <w:spacing w:before="0" w:after="0" w:line="240" w:lineRule="auto"/>
               <w:jc w:val="left"/>
             </w:pPr>
-            <w:r/>
-            <w:r>
-              <w:rPr>
-                <w:rFonts w:ascii="Aptos" w:hAnsi="Aptos"/>
-                <w:b w:val="0"/>
-                <w:color w:val="243229"/>
-                <w:sz w:val="19"/>
-              </w:rPr>
-              <w:t>Layer systems, welfare indicators and trade-offs</w:t>
-            </w:r>
+            <w:hyperlink r:id="rId56">
+              <w:r>
+                <w:rPr>
+                  <w:rStyle w:val="Hyperlink"/>
+                  <w:color w:val="0563C1"/>
+                  <w:u w:val="single"/>
+                </w:rPr>
+              </w:r>
+              <w:r>
+                <w:rPr>
+                  <w:rStyle w:val="Hyperlink"/>
+                  <w:rFonts w:ascii="Aptos" w:hAnsi="Aptos"/>
+                  <w:b w:val="0"/>
+                  <w:color w:val="0563C1"/>
+                  <w:sz w:val="19"/>
+                  <w:u w:val="single"/>
+                </w:rPr>
+                <w:t>Layer systems, welfare indicators and trade-offs</w:t>
+              </w:r>
+            </w:hyperlink>
           </w:p>
         </w:tc>
         <w:tc>

</xml_diff>